<commit_message>
Small neatening and addtion of break markers in notes
</commit_message>
<xml_diff>
--- a/Introductory/Notes/Beginner+ R Carpentry Notes Day 2.docx
+++ b/Introductory/Notes/Beginner+ R Carpentry Notes Day 2.docx
@@ -2135,16 +2135,25 @@
     </w:p>
     <w:p>
       <w:pPr>
-        <w:rPr>
-          <w:rFonts w:ascii="Trebuchet MS" w:hAnsi="Trebuchet MS"/>
-          <w:b/>
-          <w:bCs/>
-          <w:sz w:val="40"/>
-          <w:szCs w:val="40"/>
-          <w:highlight w:val="yellow"/>
-          <w:lang w:val="en-US"/>
-        </w:rPr>
-      </w:pPr>
+        <w:jc w:val="both"/>
+        <w:rPr>
+          <w:rFonts w:ascii="Trebuchet MS" w:hAnsi="Trebuchet MS"/>
+          <w:color w:val="000000" w:themeColor="text1"/>
+          <w:sz w:val="28"/>
+          <w:szCs w:val="28"/>
+          <w:lang w:val="en-US"/>
+        </w:rPr>
+      </w:pPr>
+      <w:r>
+        <w:rPr>
+          <w:rFonts w:ascii="Trebuchet MS" w:hAnsi="Trebuchet MS"/>
+          <w:color w:val="000000" w:themeColor="text1"/>
+          <w:sz w:val="28"/>
+          <w:szCs w:val="28"/>
+          <w:lang w:val="en-US"/>
+        </w:rPr>
+        <w:t>--------------------------- BREAK ---------------------------</w:t>
+      </w:r>
     </w:p>
     <w:p>
       <w:pPr>
@@ -2240,6 +2249,7 @@
           <w:szCs w:val="28"/>
           <w:lang w:val="en-US"/>
         </w:rPr>
+        <w:lastRenderedPageBreak/>
         <w:t xml:space="preserve">We are writing functions to be able to re-use parts of our code (in the project or another project) and although there is less chance of making a mistake than when we rewrite parts of code again for different scenarios we can still make mistakes. So we need to make sure that we test out functions. We have done some of that with our earlier examples, but this time we will work with a dataset to help you understand how you can use it with your work. </w:t>
       </w:r>
     </w:p>
@@ -2665,7 +2675,6 @@
           <w:szCs w:val="36"/>
           <w:lang w:val="en-US"/>
         </w:rPr>
-        <w:lastRenderedPageBreak/>
         <w:t>Head(centered)</w:t>
       </w:r>
       <w:r>
@@ -3057,7 +3066,6 @@
           <w:sz w:val="28"/>
           <w:szCs w:val="28"/>
         </w:rPr>
-        <w:lastRenderedPageBreak/>
         <w:t>We are feeling extra suspicious today, there could be a rounding error. To sooth ourselves we can use the inbuilt function for comparisions</w:t>
       </w:r>
     </w:p>
@@ -3118,8 +3126,12 @@
       <w:pPr>
         <w:rPr>
           <w:rFonts w:ascii="Trebuchet MS" w:hAnsi="Trebuchet MS"/>
-          <w:sz w:val="28"/>
-          <w:szCs w:val="28"/>
+          <w:b/>
+          <w:bCs/>
+          <w:color w:val="00B050"/>
+          <w:sz w:val="40"/>
+          <w:szCs w:val="40"/>
+          <w:lang w:val="en-US"/>
         </w:rPr>
       </w:pPr>
       <w:r>
@@ -3145,6 +3157,41 @@
           <w:lang w:val="en-US"/>
         </w:rPr>
         <w:t>Can you all write in the doc an example of a function you might write for a project and how you would test it?</w:t>
+      </w:r>
+    </w:p>
+    <w:p>
+      <w:pPr>
+        <w:rPr>
+          <w:rFonts w:ascii="Trebuchet MS" w:hAnsi="Trebuchet MS"/>
+          <w:b/>
+          <w:bCs/>
+          <w:color w:val="00B050"/>
+          <w:sz w:val="40"/>
+          <w:szCs w:val="40"/>
+          <w:lang w:val="en-US"/>
+        </w:rPr>
+      </w:pPr>
+    </w:p>
+    <w:p>
+      <w:pPr>
+        <w:jc w:val="both"/>
+        <w:rPr>
+          <w:rFonts w:ascii="Trebuchet MS" w:hAnsi="Trebuchet MS"/>
+          <w:color w:val="000000" w:themeColor="text1"/>
+          <w:sz w:val="28"/>
+          <w:szCs w:val="28"/>
+          <w:lang w:val="en-US"/>
+        </w:rPr>
+      </w:pPr>
+      <w:r>
+        <w:rPr>
+          <w:rFonts w:ascii="Trebuchet MS" w:hAnsi="Trebuchet MS"/>
+          <w:color w:val="000000" w:themeColor="text1"/>
+          <w:sz w:val="28"/>
+          <w:szCs w:val="28"/>
+          <w:lang w:val="en-US"/>
+        </w:rPr>
+        <w:t>--------------------------- BREAK ---------------------------</w:t>
       </w:r>
     </w:p>
     <w:p>
@@ -5992,7 +6039,6 @@
           <w:rFonts w:ascii="Trebuchet MS" w:hAnsi="Trebuchet MS"/>
           <w:sz w:val="28"/>
           <w:szCs w:val="28"/>
-          <w:lang w:val="en-NL"/>
         </w:rPr>
         <w:t xml:space="preserve">Error in </w:t>
       </w:r>
@@ -6001,7 +6047,6 @@
           <w:rFonts w:ascii="Trebuchet MS" w:hAnsi="Trebuchet MS"/>
           <w:sz w:val="28"/>
           <w:szCs w:val="28"/>
-          <w:lang w:val="en-NL"/>
         </w:rPr>
         <w:t>...</w:t>
       </w:r>
@@ -6010,7 +6055,6 @@
           <w:rFonts w:ascii="Trebuchet MS" w:hAnsi="Trebuchet MS"/>
           <w:sz w:val="28"/>
           <w:szCs w:val="28"/>
-          <w:lang w:val="en-NL"/>
         </w:rPr>
         <w:t xml:space="preserve"> : invalid 'type' (</w:t>
       </w:r>
@@ -6019,7 +6063,6 @@
           <w:rFonts w:ascii="Trebuchet MS" w:hAnsi="Trebuchet MS"/>
           <w:sz w:val="28"/>
           <w:szCs w:val="28"/>
-          <w:lang w:val="en-NL"/>
         </w:rPr>
         <w:t>..</w:t>
       </w:r>
@@ -6028,7 +6071,6 @@
           <w:rFonts w:ascii="Trebuchet MS" w:hAnsi="Trebuchet MS"/>
           <w:sz w:val="28"/>
           <w:szCs w:val="28"/>
-          <w:lang w:val="en-NL"/>
         </w:rPr>
         <w:t>) of argument</w:t>
       </w:r>
@@ -6383,7 +6425,6 @@
           <w:rFonts w:ascii="Trebuchet MS" w:hAnsi="Trebuchet MS"/>
           <w:sz w:val="28"/>
           <w:szCs w:val="28"/>
-          <w:lang w:val="en-NL"/>
         </w:rPr>
       </w:pPr>
       <w:r>
@@ -6400,7 +6441,6 @@
           <w:rFonts w:ascii="Trebuchet MS" w:hAnsi="Trebuchet MS"/>
           <w:sz w:val="28"/>
           <w:szCs w:val="28"/>
-          <w:lang w:val="en-NL"/>
         </w:rPr>
         <w:t>Error in file(file, "rt") : cannot open the connection</w:t>
       </w:r>
@@ -6409,7 +6449,6 @@
           <w:rFonts w:ascii="Trebuchet MS" w:hAnsi="Trebuchet MS"/>
           <w:sz w:val="28"/>
           <w:szCs w:val="28"/>
-          <w:lang w:val="en-NL"/>
         </w:rPr>
         <w:br/>
         <w:t>In addition: Warning message:</w:t>
@@ -6419,7 +6458,6 @@
           <w:rFonts w:ascii="Trebuchet MS" w:hAnsi="Trebuchet MS"/>
           <w:sz w:val="28"/>
           <w:szCs w:val="28"/>
-          <w:lang w:val="en-NL"/>
         </w:rPr>
         <w:br/>
         <w:t>In file(file, "rt") :</w:t>
@@ -6429,7 +6467,6 @@
           <w:rFonts w:ascii="Trebuchet MS" w:hAnsi="Trebuchet MS"/>
           <w:sz w:val="28"/>
           <w:szCs w:val="28"/>
-          <w:lang w:val="en-NL"/>
         </w:rPr>
         <w:br/>
         <w:t xml:space="preserve">  cannot open file 'nonexistent_file.csv': No such file or directory</w:t>
@@ -8425,6 +8462,7 @@
   <w:style w:type="character" w:default="1" w:styleId="DefaultParagraphFont">
     <w:name w:val="Default Paragraph Font"/>
     <w:uiPriority w:val="1"/>
+    <w:semiHidden/>
     <w:unhideWhenUsed/>
   </w:style>
   <w:style w:type="table" w:default="1" w:styleId="TableNormal">

</xml_diff>